<commit_message>
fix: handle Word COM rejected callee error, clean Chrome workers on exit, format Rp numbers without truncation, and update apel TK display to x
</commit_message>
<xml_diff>
--- a/files/TEMPLATE_TPP.docx
+++ b/files/TEMPLATE_TPP.docx
@@ -1,6 +1,6 @@
 
 <file path=word/document.xml><?xml version="1.0" encoding="utf-8"?>
-<w:document xmlns:wpc="http://schemas.microsoft.com/office/word/2010/wordprocessingCanvas" xmlns:cx="http://schemas.microsoft.com/office/drawing/2014/chartex" xmlns:cx1="http://schemas.microsoft.com/office/drawing/2015/9/8/chartex" xmlns:cx2="http://schemas.microsoft.com/office/drawing/2015/10/21/chartex" xmlns:cx3="http://schemas.microsoft.com/office/drawing/2016/5/9/chartex" xmlns:cx4="http://schemas.microsoft.com/office/drawing/2016/5/10/chartex" xmlns:cx5="http://schemas.microsoft.com/office/drawing/2016/5/11/chartex" xmlns:cx6="http://schemas.microsoft.com/office/drawing/2016/5/12/chartex" xmlns:cx7="http://schemas.microsoft.com/office/drawing/2016/5/13/chartex" xmlns:cx8="http://schemas.microsoft.com/office/drawing/2016/5/14/chartex" xmlns:mc="http://schemas.openxmlformats.org/markup-compatibility/2006" xmlns:aink="http://schemas.microsoft.com/office/drawing/2016/ink" xmlns:am3d="http://schemas.microsoft.com/office/drawing/2017/model3d" xmlns:o="urn:schemas-microsoft-com:office:office" xmlns:oel="http://schemas.microsoft.com/office/2019/extlst" xmlns:r="http://schemas.openxmlformats.org/officeDocument/2006/relationships" xmlns:m="http://schemas.openxmlformats.org/officeDocument/2006/math" xmlns:v="urn:schemas-microsoft-com:vml" xmlns:wp14="http://schemas.microsoft.com/office/word/2010/wordprocessingDrawing" xmlns:wp="http://schemas.openxmlformats.org/drawingml/2006/wordprocessingDrawing" xmlns:w10="urn:schemas-microsoft-com:office:word" xmlns:w="http://schemas.openxmlformats.org/wordprocessingml/2006/main" xmlns:w14="http://schemas.microsoft.com/office/word/2010/wordml" xmlns:w15="http://schemas.microsoft.com/office/word/2012/wordml" xmlns:w16cex="http://schemas.microsoft.com/office/word/2018/wordml/cex" xmlns:w16cid="http://schemas.microsoft.com/office/word/2016/wordml/cid" xmlns:w16="http://schemas.microsoft.com/office/word/2018/wordml" xmlns:w16du="http://schemas.microsoft.com/office/word/2023/wordml/word16du" xmlns:w16sdtdh="http://schemas.microsoft.com/office/word/2020/wordml/sdtdatahash" xmlns:w16sdtfl="http://schemas.microsoft.com/office/word/2024/wordml/sdtformatlock" xmlns:w16se="http://schemas.microsoft.com/office/word/2015/wordml/symex" xmlns:wpg="http://schemas.microsoft.com/office/word/2010/wordprocessingGroup" xmlns:wpi="http://schemas.microsoft.com/office/word/2010/wordprocessingInk" xmlns:wne="http://schemas.microsoft.com/office/word/2006/wordml" xmlns:wps="http://schemas.microsoft.com/office/word/2010/wordprocessingShape" mc:Ignorable="w14 w15 w16se w16cid w16 w16cex w16sdtdh w16sdtfl w16du wp14">
+<w:document xmlns:wpc="http://schemas.microsoft.com/office/word/2010/wordprocessingCanvas" xmlns:cx="http://schemas.microsoft.com/office/drawing/2014/chartex" xmlns:cx1="http://schemas.microsoft.com/office/drawing/2015/9/8/chartex" xmlns:cx2="http://schemas.microsoft.com/office/drawing/2015/10/21/chartex" xmlns:cx3="http://schemas.microsoft.com/office/drawing/2016/5/9/chartex" xmlns:cx4="http://schemas.microsoft.com/office/drawing/2016/5/10/chartex" xmlns:cx5="http://schemas.microsoft.com/office/drawing/2016/5/11/chartex" xmlns:cx6="http://schemas.microsoft.com/office/drawing/2016/5/12/chartex" xmlns:cx7="http://schemas.microsoft.com/office/drawing/2016/5/13/chartex" xmlns:cx8="http://schemas.microsoft.com/office/drawing/2016/5/14/chartex" xmlns:mc="http://schemas.openxmlformats.org/markup-compatibility/2006" xmlns:aink="http://schemas.microsoft.com/office/drawing/2016/ink" xmlns:am3d="http://schemas.microsoft.com/office/drawing/2017/model3d" xmlns:o="urn:schemas-microsoft-com:office:office" xmlns:oel="http://schemas.microsoft.com/office/2019/extlst" xmlns:r="http://schemas.openxmlformats.org/officeDocument/2006/relationships" xmlns:m="http://schemas.openxmlformats.org/officeDocument/2006/math" xmlns:v="urn:schemas-microsoft-com:vml" xmlns:wp14="http://schemas.microsoft.com/office/word/2010/wordprocessingDrawing" xmlns:wp="http://schemas.openxmlformats.org/drawingml/2006/wordprocessingDrawing" xmlns:w10="urn:schemas-microsoft-com:office:word" xmlns:w="http://schemas.openxmlformats.org/wordprocessingml/2006/main" xmlns:w14="http://schemas.microsoft.com/office/word/2010/wordml" xmlns:w15="http://schemas.microsoft.com/office/word/2012/wordml" xmlns:w16cei="http://schemas.microsoft.com/office/word/2026/wordml/cei" xmlns:w16cex="http://schemas.microsoft.com/office/word/2018/wordml/cex" xmlns:w16cid="http://schemas.microsoft.com/office/word/2016/wordml/cid" xmlns:w16="http://schemas.microsoft.com/office/word/2018/wordml" xmlns:w16du="http://schemas.microsoft.com/office/word/2023/wordml/word16du" xmlns:w16sdtdh="http://schemas.microsoft.com/office/word/2020/wordml/sdtdatahash" xmlns:w16sdtfl="http://schemas.microsoft.com/office/word/2024/wordml/sdtformatlock" xmlns:w16se="http://schemas.microsoft.com/office/word/2015/wordml/symex" xmlns:wpg="http://schemas.microsoft.com/office/word/2010/wordprocessingGroup" xmlns:wpi="http://schemas.microsoft.com/office/word/2010/wordprocessingInk" xmlns:wne="http://schemas.microsoft.com/office/word/2006/wordml" xmlns:wps="http://schemas.microsoft.com/office/word/2010/wordprocessingShape" mc:Ignorable="w14 w15 w16se w16cid w16 w16cex w16sdtdh w16sdtfl w16du wp14">
   <w:body>
     <w:p>
       <w:pPr>
@@ -89,7 +89,7 @@
           <w:noProof/>
           <w:lang w:val="sv-SE"/>
         </w:rPr>
-        <w:t>FEBRUARI</w:t>
+        <w:t>JUNI</w:t>
       </w:r>
       <w:r>
         <w:rPr>
@@ -252,7 +252,7 @@
                 <w:rFonts w:ascii="Arial" w:hAnsi="Arial" w:cs="Arial"/>
                 <w:noProof/>
               </w:rPr>
-              <w:t>WALIJO, S.A.P</w:t>
+              <w:t>AZANU RUDIT SEPTIMA S.P</w:t>
             </w:r>
             <w:r>
               <w:rPr>
@@ -345,7 +345,7 @@
                 <w:noProof/>
                 <w:lang w:val="sv-SE"/>
               </w:rPr>
-              <w:t>19770424 200701 1 007</w:t>
+              <w:t>19900507 201403 1 002</w:t>
             </w:r>
             <w:r>
               <w:rPr>
@@ -438,7 +438,7 @@
                 <w:noProof/>
                 <w:lang w:val="sv-SE"/>
               </w:rPr>
-              <w:t>III/a</w:t>
+              <w:t>III/d</w:t>
             </w:r>
             <w:r>
               <w:rPr>
@@ -616,7 +616,7 @@
                 <w:noProof/>
                 <w:lang w:val="sv-SE"/>
               </w:rPr>
-              <w:t>7</w:t>
+              <w:t>10</w:t>
             </w:r>
             <w:r>
               <w:rPr>
@@ -709,7 +709,7 @@
                 <w:noProof/>
                 <w:lang w:val="sv-SE"/>
               </w:rPr>
-              <w:t>890</w:t>
+              <w:t>1735</w:t>
             </w:r>
             <w:r>
               <w:rPr>
@@ -800,7 +800,7 @@
               <w:rPr>
                 <w:rFonts w:ascii="Arial" w:hAnsi="Arial" w:cs="Arial"/>
               </w:rPr>
-              <w:instrText xml:space="preserve"> \# #.###</w:instrText>
+              <w:instrText xml:space="preserve"> </w:instrText>
             </w:r>
             <w:r>
               <w:rPr>
@@ -814,7 +814,7 @@
                 <w:rFonts w:ascii="Arial" w:hAnsi="Arial" w:cs="Arial"/>
                 <w:noProof/>
               </w:rPr>
-              <w:t>2.220.000</w:t>
+              <w:t>5.050.000</w:t>
             </w:r>
             <w:r>
               <w:rPr>
@@ -848,19 +848,20 @@
     <w:tbl>
       <w:tblPr>
         <w:tblStyle w:val="TableGrid"/>
-        <w:tblW w:w="8783" w:type="dxa"/>
+        <w:tblW w:w="8784" w:type="dxa"/>
         <w:tblLook w:val="04A0" w:firstRow="1" w:lastRow="0" w:firstColumn="1" w:lastColumn="0" w:noHBand="0" w:noVBand="1"/>
       </w:tblPr>
       <w:tblGrid>
-        <w:gridCol w:w="1555"/>
-        <w:gridCol w:w="1275"/>
-        <w:gridCol w:w="3260"/>
-        <w:gridCol w:w="2693"/>
+        <w:gridCol w:w="1696"/>
+        <w:gridCol w:w="1560"/>
+        <w:gridCol w:w="1553"/>
+        <w:gridCol w:w="1423"/>
+        <w:gridCol w:w="2552"/>
       </w:tblGrid>
       <w:tr>
         <w:tc>
           <w:tcPr>
-            <w:tcW w:w="1555" w:type="dxa"/>
+            <w:tcW w:w="1696" w:type="dxa"/>
             <w:vAlign w:val="center"/>
           </w:tcPr>
           <w:p>
@@ -882,7 +883,7 @@
         </w:tc>
         <w:tc>
           <w:tcPr>
-            <w:tcW w:w="1275" w:type="dxa"/>
+            <w:tcW w:w="1560" w:type="dxa"/>
             <w:vAlign w:val="center"/>
           </w:tcPr>
           <w:p>
@@ -904,7 +905,7 @@
         </w:tc>
         <w:tc>
           <w:tcPr>
-            <w:tcW w:w="3260" w:type="dxa"/>
+            <w:tcW w:w="1553" w:type="dxa"/>
             <w:vAlign w:val="center"/>
           </w:tcPr>
           <w:p>
@@ -918,13 +919,33 @@
               <w:rPr>
                 <w:rFonts w:ascii="Arial" w:hAnsi="Arial" w:cs="Arial"/>
               </w:rPr>
+              <w:t>TIDAK MASUK KERJA</w:t>
+            </w:r>
+          </w:p>
+        </w:tc>
+        <w:tc>
+          <w:tcPr>
+            <w:tcW w:w="1423" w:type="dxa"/>
+            <w:vAlign w:val="center"/>
+          </w:tcPr>
+          <w:p>
+            <w:pPr>
+              <w:jc w:val="center"/>
+              <w:rPr>
+                <w:rFonts w:ascii="Arial" w:hAnsi="Arial" w:cs="Arial"/>
+              </w:rPr>
+            </w:pPr>
+            <w:r>
+              <w:rPr>
+                <w:rFonts w:ascii="Arial" w:hAnsi="Arial" w:cs="Arial"/>
+              </w:rPr>
               <w:t>TOTAL CAPAIAN</w:t>
             </w:r>
           </w:p>
         </w:tc>
         <w:tc>
           <w:tcPr>
-            <w:tcW w:w="2693" w:type="dxa"/>
+            <w:tcW w:w="2552" w:type="dxa"/>
           </w:tcPr>
           <w:p>
             <w:pPr>
@@ -962,7 +983,7 @@
         </w:trPr>
         <w:tc>
           <w:tcPr>
-            <w:tcW w:w="1555" w:type="dxa"/>
+            <w:tcW w:w="1696" w:type="dxa"/>
             <w:vAlign w:val="center"/>
           </w:tcPr>
           <w:p>
@@ -976,7 +997,38 @@
               <w:rPr>
                 <w:rFonts w:ascii="Arial" w:hAnsi="Arial" w:cs="Arial"/>
               </w:rPr>
-              <w:t>60</w:t>
+              <w:fldChar w:fldCharType="begin"/>
+            </w:r>
+            <w:r>
+              <w:rPr>
+                <w:rFonts w:ascii="Arial" w:hAnsi="Arial" w:cs="Arial"/>
+              </w:rPr>
+              <w:instrText xml:space="preserve"> MERGEFIELD Skor_Kinerja_ </w:instrText>
+            </w:r>
+            <w:r>
+              <w:rPr>
+                <w:rFonts w:ascii="Arial" w:hAnsi="Arial" w:cs="Arial"/>
+              </w:rPr>
+              <w:instrText>\#"0,00"</w:instrText>
+            </w:r>
+            <w:r>
+              <w:rPr>
+                <w:rFonts w:ascii="Arial" w:hAnsi="Arial" w:cs="Arial"/>
+              </w:rPr>
+              <w:fldChar w:fldCharType="separate"/>
+            </w:r>
+            <w:r>
+              <w:rPr>
+                <w:rFonts w:ascii="Arial" w:hAnsi="Arial" w:cs="Arial"/>
+                <w:noProof/>
+              </w:rPr>
+              <w:t>60,00</w:t>
+            </w:r>
+            <w:r>
+              <w:rPr>
+                <w:rFonts w:ascii="Arial" w:hAnsi="Arial" w:cs="Arial"/>
+              </w:rPr>
+              <w:fldChar w:fldCharType="end"/>
             </w:r>
             <w:r>
               <w:rPr>
@@ -988,7 +1040,7 @@
         </w:tc>
         <w:tc>
           <w:tcPr>
-            <w:tcW w:w="1275" w:type="dxa"/>
+            <w:tcW w:w="1560" w:type="dxa"/>
             <w:vAlign w:val="center"/>
           </w:tcPr>
           <w:p>
@@ -1002,13 +1054,50 @@
               <w:rPr>
                 <w:rFonts w:ascii="Arial" w:hAnsi="Arial" w:cs="Arial"/>
               </w:rPr>
-              <w:t>40%</w:t>
-            </w:r>
-          </w:p>
-        </w:tc>
-        <w:tc>
-          <w:tcPr>
-            <w:tcW w:w="3260" w:type="dxa"/>
+              <w:fldChar w:fldCharType="begin"/>
+            </w:r>
+            <w:r>
+              <w:rPr>
+                <w:rFonts w:ascii="Arial" w:hAnsi="Arial" w:cs="Arial"/>
+              </w:rPr>
+              <w:instrText xml:space="preserve"> MERGEFIELD Skor_Kehadiran_ </w:instrText>
+            </w:r>
+            <w:r>
+              <w:rPr>
+                <w:rFonts w:ascii="Arial" w:hAnsi="Arial" w:cs="Arial"/>
+              </w:rPr>
+              <w:instrText>\#"0,00"</w:instrText>
+            </w:r>
+            <w:r>
+              <w:rPr>
+                <w:rFonts w:ascii="Arial" w:hAnsi="Arial" w:cs="Arial"/>
+              </w:rPr>
+              <w:fldChar w:fldCharType="separate"/>
+            </w:r>
+            <w:r>
+              <w:rPr>
+                <w:rFonts w:ascii="Arial" w:hAnsi="Arial" w:cs="Arial"/>
+                <w:noProof/>
+              </w:rPr>
+              <w:t>40,00</w:t>
+            </w:r>
+            <w:r>
+              <w:rPr>
+                <w:rFonts w:ascii="Arial" w:hAnsi="Arial" w:cs="Arial"/>
+              </w:rPr>
+              <w:fldChar w:fldCharType="end"/>
+            </w:r>
+            <w:r>
+              <w:rPr>
+                <w:rFonts w:ascii="Arial" w:hAnsi="Arial" w:cs="Arial"/>
+              </w:rPr>
+              <w:t>%</w:t>
+            </w:r>
+          </w:p>
+        </w:tc>
+        <w:tc>
+          <w:tcPr>
+            <w:tcW w:w="1553" w:type="dxa"/>
             <w:vAlign w:val="center"/>
           </w:tcPr>
           <w:p>
@@ -1022,13 +1111,56 @@
               <w:rPr>
                 <w:rFonts w:ascii="Arial" w:hAnsi="Arial" w:cs="Arial"/>
               </w:rPr>
-              <w:t>100%</w:t>
-            </w:r>
-          </w:p>
-        </w:tc>
-        <w:tc>
-          <w:tcPr>
-            <w:tcW w:w="2693" w:type="dxa"/>
+              <w:fldChar w:fldCharType="begin"/>
+            </w:r>
+            <w:r>
+              <w:rPr>
+                <w:rFonts w:ascii="Arial" w:hAnsi="Arial" w:cs="Arial"/>
+              </w:rPr>
+              <w:instrText xml:space="preserve"> MERGEFIELD TMK_Persen</w:instrText>
+            </w:r>
+            <w:r>
+              <w:rPr>
+                <w:rFonts w:ascii="Arial" w:hAnsi="Arial" w:cs="Arial"/>
+              </w:rPr>
+              <w:instrText>\#"0,00"</w:instrText>
+            </w:r>
+            <w:r>
+              <w:rPr>
+                <w:rFonts w:ascii="Arial" w:hAnsi="Arial" w:cs="Arial"/>
+              </w:rPr>
+              <w:instrText xml:space="preserve"> </w:instrText>
+            </w:r>
+            <w:r>
+              <w:rPr>
+                <w:rFonts w:ascii="Arial" w:hAnsi="Arial" w:cs="Arial"/>
+              </w:rPr>
+              <w:fldChar w:fldCharType="separate"/>
+            </w:r>
+            <w:r>
+              <w:rPr>
+                <w:rFonts w:ascii="Arial" w:hAnsi="Arial" w:cs="Arial"/>
+                <w:noProof/>
+              </w:rPr>
+              <w:t>2,00</w:t>
+            </w:r>
+            <w:r>
+              <w:rPr>
+                <w:rFonts w:ascii="Arial" w:hAnsi="Arial" w:cs="Arial"/>
+              </w:rPr>
+              <w:fldChar w:fldCharType="end"/>
+            </w:r>
+            <w:r>
+              <w:rPr>
+                <w:rFonts w:ascii="Arial" w:hAnsi="Arial" w:cs="Arial"/>
+              </w:rPr>
+              <w:t>%</w:t>
+            </w:r>
+          </w:p>
+        </w:tc>
+        <w:tc>
+          <w:tcPr>
+            <w:tcW w:w="1423" w:type="dxa"/>
             <w:vAlign w:val="center"/>
           </w:tcPr>
           <w:p>
@@ -1042,38 +1174,23 @@
               <w:rPr>
                 <w:rFonts w:ascii="Arial" w:hAnsi="Arial" w:cs="Arial"/>
               </w:rPr>
-              <w:t>Rp.</w:t>
-            </w:r>
-            <w:r>
-              <w:rPr>
-                <w:rFonts w:ascii="Arial" w:hAnsi="Arial" w:cs="Arial"/>
-              </w:rPr>
-              <w:t xml:space="preserve"> </w:t>
-            </w:r>
-            <w:r>
-              <w:rPr>
-                <w:rFonts w:ascii="Arial" w:hAnsi="Arial" w:cs="Arial"/>
-                <w:lang w:val="sv-SE"/>
-              </w:rPr>
               <w:fldChar w:fldCharType="begin"/>
             </w:r>
             <w:r>
               <w:rPr>
                 <w:rFonts w:ascii="Arial" w:hAnsi="Arial" w:cs="Arial"/>
-                <w:lang w:val="sv-SE"/>
-              </w:rPr>
-              <w:instrText xml:space="preserve"> MERGEFIELD TPP_Asli </w:instrText>
-            </w:r>
-            <w:r>
-              <w:rPr>
-                <w:rFonts w:ascii="Arial" w:hAnsi="Arial" w:cs="Arial"/>
-              </w:rPr>
-              <w:instrText xml:space="preserve"> \# #.###</w:instrText>
-            </w:r>
-            <w:r>
-              <w:rPr>
-                <w:rFonts w:ascii="Arial" w:hAnsi="Arial" w:cs="Arial"/>
-                <w:lang w:val="sv-SE"/>
+              </w:rPr>
+              <w:instrText xml:space="preserve"> MERGEFIELD Persentase_Total </w:instrText>
+            </w:r>
+            <w:r>
+              <w:rPr>
+                <w:rFonts w:ascii="Arial" w:hAnsi="Arial" w:cs="Arial"/>
+              </w:rPr>
+              <w:instrText>\#"0,00"</w:instrText>
+            </w:r>
+            <w:r>
+              <w:rPr>
+                <w:rFonts w:ascii="Arial" w:hAnsi="Arial" w:cs="Arial"/>
               </w:rPr>
               <w:fldChar w:fldCharType="separate"/>
             </w:r>
@@ -1082,7 +1199,73 @@
                 <w:rFonts w:ascii="Arial" w:hAnsi="Arial" w:cs="Arial"/>
                 <w:noProof/>
               </w:rPr>
-              <w:t>2.220.000</w:t>
+              <w:t>98,00</w:t>
+            </w:r>
+            <w:r>
+              <w:rPr>
+                <w:rFonts w:ascii="Arial" w:hAnsi="Arial" w:cs="Arial"/>
+              </w:rPr>
+              <w:fldChar w:fldCharType="end"/>
+            </w:r>
+            <w:r>
+              <w:rPr>
+                <w:rFonts w:ascii="Arial" w:hAnsi="Arial" w:cs="Arial"/>
+              </w:rPr>
+              <w:t>%</w:t>
+            </w:r>
+          </w:p>
+        </w:tc>
+        <w:tc>
+          <w:tcPr>
+            <w:tcW w:w="2552" w:type="dxa"/>
+            <w:vAlign w:val="center"/>
+          </w:tcPr>
+          <w:p>
+            <w:pPr>
+              <w:jc w:val="center"/>
+              <w:rPr>
+                <w:rFonts w:ascii="Arial" w:hAnsi="Arial" w:cs="Arial"/>
+              </w:rPr>
+            </w:pPr>
+            <w:r>
+              <w:rPr>
+                <w:rFonts w:ascii="Arial" w:hAnsi="Arial" w:cs="Arial"/>
+              </w:rPr>
+              <w:t xml:space="preserve">Rp. </w:t>
+            </w:r>
+            <w:r>
+              <w:rPr>
+                <w:rFonts w:ascii="Arial" w:hAnsi="Arial" w:cs="Arial"/>
+                <w:lang w:val="sv-SE"/>
+              </w:rPr>
+              <w:fldChar w:fldCharType="begin"/>
+            </w:r>
+            <w:r>
+              <w:rPr>
+                <w:rFonts w:ascii="Arial" w:hAnsi="Arial" w:cs="Arial"/>
+                <w:lang w:val="sv-SE"/>
+              </w:rPr>
+              <w:instrText xml:space="preserve"> MERGEFIELD jumlah_TP </w:instrText>
+            </w:r>
+            <w:r>
+              <w:rPr>
+                <w:rFonts w:ascii="Arial" w:hAnsi="Arial" w:cs="Arial"/>
+              </w:rPr>
+              <w:instrText/>
+            </w:r>
+            <w:r>
+              <w:rPr>
+                <w:rFonts w:ascii="Arial" w:hAnsi="Arial" w:cs="Arial"/>
+                <w:lang w:val="sv-SE"/>
+              </w:rPr>
+              <w:fldChar w:fldCharType="separate"/>
+            </w:r>
+            <w:r>
+              <w:rPr>
+                <w:rFonts w:ascii="Arial" w:hAnsi="Arial" w:cs="Arial"/>
+                <w:noProof/>
+              </w:rPr>
+              <w:t>4.949.000</w:t>
             </w:r>
             <w:r>
               <w:rPr>
@@ -1117,7 +1300,6 @@
       <w:pPr>
         <w:spacing w:after="0"/>
         <w:ind w:left="4253"/>
-        <w:jc w:val="center"/>
         <w:rPr>
           <w:rFonts w:ascii="Arial" w:hAnsi="Arial" w:cs="Arial"/>
           <w:lang w:val="sv-SE"/>
@@ -1135,7 +1317,6 @@
       <w:pPr>
         <w:spacing w:after="0"/>
         <w:ind w:left="4253"/>
-        <w:jc w:val="center"/>
         <w:rPr>
           <w:rFonts w:ascii="Arial" w:hAnsi="Arial" w:cs="Arial"/>
           <w:lang w:val="sv-SE"/>
@@ -1151,9 +1332,8 @@
     </w:p>
     <w:p>
       <w:pPr>
-        <w:spacing w:after="0"/>
+        <w:spacing w:after="0" w:line="240" w:lineRule="auto"/>
         <w:ind w:left="4253"/>
-        <w:jc w:val="center"/>
         <w:rPr>
           <w:rFonts w:ascii="Arial" w:hAnsi="Arial" w:cs="Arial"/>
           <w:lang w:val="sv-SE"/>
@@ -1162,9 +1342,8 @@
     </w:p>
     <w:p>
       <w:pPr>
-        <w:spacing w:after="0"/>
+        <w:spacing w:after="0" w:line="240" w:lineRule="auto"/>
         <w:ind w:left="4253"/>
-        <w:jc w:val="center"/>
         <w:rPr>
           <w:rFonts w:ascii="Arial" w:hAnsi="Arial" w:cs="Arial"/>
           <w:lang w:val="sv-SE"/>
@@ -1173,9 +1352,8 @@
     </w:p>
     <w:p>
       <w:pPr>
-        <w:spacing w:after="0"/>
+        <w:spacing w:after="0" w:line="240" w:lineRule="auto"/>
         <w:ind w:left="4253"/>
-        <w:jc w:val="center"/>
         <w:rPr>
           <w:rFonts w:ascii="Arial" w:hAnsi="Arial" w:cs="Arial"/>
           <w:lang w:val="sv-SE"/>
@@ -1184,9 +1362,42 @@
     </w:p>
     <w:p>
       <w:pPr>
-        <w:spacing w:after="0"/>
+        <w:spacing w:after="0" w:line="240" w:lineRule="auto"/>
         <w:ind w:left="4253"/>
-        <w:jc w:val="center"/>
+        <w:rPr>
+          <w:rFonts w:ascii="Arial" w:hAnsi="Arial" w:cs="Arial"/>
+          <w:lang w:val="sv-SE"/>
+        </w:rPr>
+      </w:pPr>
+      <w:r>
+        <w:rPr>
+          <w:rFonts w:ascii="Arial" w:hAnsi="Arial" w:cs="Arial"/>
+        </w:rPr>
+        <w:t xml:space="preserve">     </w:t>
+      </w:r>
+      <w:r>
+        <w:rPr>
+          <w:rFonts w:ascii="Arial" w:hAnsi="Arial" w:cs="Arial"/>
+        </w:rPr>
+        <w:fldChar w:fldCharType="begin"/>
+      </w:r>
+      <w:r>
+        <w:rPr>
+          <w:rFonts w:ascii="Arial" w:hAnsi="Arial" w:cs="Arial"/>
+        </w:rPr>
+        <w:instrText xml:space="preserve"> MERGEFIELD tte </w:instrText>
+      </w:r>
+      <w:r>
+        <w:rPr>
+          <w:rFonts w:ascii="Arial" w:hAnsi="Arial" w:cs="Arial"/>
+        </w:rPr>
+        <w:fldChar w:fldCharType="end"/>
+      </w:r>
+    </w:p>
+    <w:p>
+      <w:pPr>
+        <w:spacing w:after="0" w:line="240" w:lineRule="auto"/>
+        <w:ind w:left="4253"/>
         <w:rPr>
           <w:rFonts w:ascii="Arial" w:hAnsi="Arial" w:cs="Arial"/>
           <w:lang w:val="sv-SE"/>
@@ -1195,9 +1406,28 @@
     </w:p>
     <w:p>
       <w:pPr>
-        <w:spacing w:after="0"/>
+        <w:spacing w:after="0" w:line="240" w:lineRule="auto"/>
         <w:ind w:left="4253"/>
-        <w:jc w:val="center"/>
+        <w:rPr>
+          <w:rFonts w:ascii="Arial" w:hAnsi="Arial" w:cs="Arial"/>
+          <w:lang w:val="sv-SE"/>
+        </w:rPr>
+      </w:pPr>
+    </w:p>
+    <w:p>
+      <w:pPr>
+        <w:spacing w:after="0" w:line="240" w:lineRule="auto"/>
+        <w:ind w:left="4253"/>
+        <w:rPr>
+          <w:rFonts w:ascii="Arial" w:hAnsi="Arial" w:cs="Arial"/>
+          <w:lang w:val="sv-SE"/>
+        </w:rPr>
+      </w:pPr>
+    </w:p>
+    <w:p>
+      <w:pPr>
+        <w:spacing w:after="0" w:line="240" w:lineRule="auto"/>
+        <w:ind w:left="4253"/>
         <w:rPr>
           <w:rFonts w:ascii="Arial" w:hAnsi="Arial" w:cs="Arial"/>
           <w:lang w:val="sv-SE"/>
@@ -1230,7 +1460,7 @@
           <w:noProof/>
           <w:lang w:val="sv-SE"/>
         </w:rPr>
-        <w:t>PANDARIA RILIYANA S.P, M.M</w:t>
+        <w:t>Ir LINGGA SAKTI DAMAYANTI S.Hut., M.M</w:t>
       </w:r>
       <w:r>
         <w:rPr>
@@ -1244,7 +1474,6 @@
       <w:pPr>
         <w:spacing w:after="0"/>
         <w:ind w:left="4253"/>
-        <w:jc w:val="center"/>
         <w:rPr>
           <w:rFonts w:ascii="Arial" w:hAnsi="Arial" w:cs="Arial"/>
           <w:lang w:val="en-US"/>
@@ -1291,7 +1520,7 @@
           <w:noProof/>
           <w:lang w:val="en-US"/>
         </w:rPr>
-        <w:t>19780105 200212 2 002</w:t>
+        <w:t>19820418 200604 2 012</w:t>
       </w:r>
       <w:r>
         <w:rPr>
@@ -1436,7 +1665,7 @@
                 <w:noProof/>
                 <w:lang w:val="en-US"/>
               </w:rPr>
-              <w:t>WALIJO, S.A.P</w:t>
+              <w:t>AZANU RUDIT SEPTIMA S.P</w:t>
             </w:r>
             <w:r>
               <w:rPr>
@@ -1528,7 +1757,7 @@
                 <w:noProof/>
                 <w:lang w:val="en-US"/>
               </w:rPr>
-              <w:t>19770424 200701 1 007</w:t>
+              <w:t>19900507 201403 1 002</w:t>
             </w:r>
             <w:r>
               <w:rPr>
@@ -1619,7 +1848,7 @@
                 <w:noProof/>
                 <w:lang w:val="en-US"/>
               </w:rPr>
-              <w:t>Februari</w:t>
+              <w:t>Juni</w:t>
             </w:r>
             <w:r>
               <w:rPr>
@@ -2190,9 +2419,23 @@
                 <w:lang w:eastAsia="en-ID"/>
                 <w14:ligatures w14:val="none"/>
               </w:rPr>
-              <w:t xml:space="preserve">                  (</w:t>
+              <w:t xml:space="preserve">               </w:t>
+            </w:r>
+            <w:proofErr w:type="gramStart"/>
+            <w:r>
+              <w:rPr>
+                <w:rFonts w:ascii="Arial" w:eastAsia="Times New Roman" w:hAnsi="Arial" w:cs="Arial"/>
+                <w:b/>
+                <w:bCs/>
+                <w:color w:val="000000"/>
+                <w:kern w:val="0"/>
+                <w:lang w:eastAsia="en-ID"/>
+                <w14:ligatures w14:val="none"/>
+              </w:rPr>
+              <w:t xml:space="preserve">   (</w:t>
             </w:r>
             <w:proofErr w:type="spellStart"/>
+            <w:proofErr w:type="gramEnd"/>
             <w:r>
               <w:rPr>
                 <w:rFonts w:ascii="Arial" w:eastAsia="Times New Roman" w:hAnsi="Arial" w:cs="Arial"/>
@@ -2402,7 +2645,7 @@
                 <w:lang w:eastAsia="en-ID"/>
                 <w14:ligatures w14:val="none"/>
               </w:rPr>
-              <w:t>0</w:t>
+              <w:t>1</w:t>
             </w:r>
             <w:r>
               <w:rPr>
@@ -2488,7 +2731,7 @@
                 <w:lang w:eastAsia="en-ID"/>
                 <w14:ligatures w14:val="none"/>
               </w:rPr>
-              <w:t>0</w:t>
+              <w:t>2</w:t>
             </w:r>
             <w:r>
               <w:rPr>
@@ -3114,7 +3357,29 @@
                 <w:lang w:eastAsia="en-ID"/>
                 <w14:ligatures w14:val="none"/>
               </w:rPr>
-              <w:t xml:space="preserve">Tidak Memakai </w:t>
+              <w:t xml:space="preserve">Tidak </w:t>
+            </w:r>
+            <w:proofErr w:type="spellStart"/>
+            <w:r>
+              <w:rPr>
+                <w:rFonts w:ascii="Arial" w:eastAsia="Times New Roman" w:hAnsi="Arial" w:cs="Arial"/>
+                <w:color w:val="000000"/>
+                <w:kern w:val="0"/>
+                <w:lang w:eastAsia="en-ID"/>
+                <w14:ligatures w14:val="none"/>
+              </w:rPr>
+              <w:t>Memakai</w:t>
+            </w:r>
+            <w:proofErr w:type="spellEnd"/>
+            <w:r>
+              <w:rPr>
+                <w:rFonts w:ascii="Arial" w:eastAsia="Times New Roman" w:hAnsi="Arial" w:cs="Arial"/>
+                <w:color w:val="000000"/>
+                <w:kern w:val="0"/>
+                <w:lang w:eastAsia="en-ID"/>
+                <w14:ligatures w14:val="none"/>
+              </w:rPr>
+              <w:t xml:space="preserve"> </w:t>
             </w:r>
             <w:proofErr w:type="spellStart"/>
             <w:r>
@@ -3668,9 +3933,23 @@
                 <w:lang w:eastAsia="en-ID"/>
                 <w14:ligatures w14:val="none"/>
               </w:rPr>
-              <w:t xml:space="preserve">                  (</w:t>
+              <w:t xml:space="preserve">               </w:t>
+            </w:r>
+            <w:proofErr w:type="gramStart"/>
+            <w:r>
+              <w:rPr>
+                <w:rFonts w:ascii="Arial" w:eastAsia="Times New Roman" w:hAnsi="Arial" w:cs="Arial"/>
+                <w:b/>
+                <w:bCs/>
+                <w:color w:val="000000"/>
+                <w:kern w:val="0"/>
+                <w:lang w:eastAsia="en-ID"/>
+                <w14:ligatures w14:val="none"/>
+              </w:rPr>
+              <w:t xml:space="preserve">   (</w:t>
             </w:r>
             <w:proofErr w:type="spellStart"/>
+            <w:proofErr w:type="gramEnd"/>
             <w:r>
               <w:rPr>
                 <w:rFonts w:ascii="Arial" w:eastAsia="Times New Roman" w:hAnsi="Arial" w:cs="Arial"/>
@@ -5093,6 +5372,7 @@
               <w:t xml:space="preserve"> % </w:t>
             </w:r>
             <w:proofErr w:type="spellStart"/>
+            <w:proofErr w:type="gramStart"/>
             <w:r>
               <w:rPr>
                 <w:rFonts w:ascii="Arial" w:eastAsia="Times New Roman" w:hAnsi="Arial" w:cs="Arial"/>
@@ -5142,7 +5422,20 @@
                 <w:lang w:eastAsia="en-ID"/>
                 <w14:ligatures w14:val="none"/>
               </w:rPr>
-              <w:t xml:space="preserve">)                      </w:t>
+              <w:t xml:space="preserve">)   </w:t>
+            </w:r>
+            <w:proofErr w:type="gramEnd"/>
+            <w:r>
+              <w:rPr>
+                <w:rFonts w:ascii="Arial" w:eastAsia="Times New Roman" w:hAnsi="Arial" w:cs="Arial"/>
+                <w:b/>
+                <w:bCs/>
+                <w:color w:val="000000"/>
+                <w:kern w:val="0"/>
+                <w:lang w:eastAsia="en-ID"/>
+                <w14:ligatures w14:val="none"/>
+              </w:rPr>
+              <w:t xml:space="preserve">                   </w:t>
             </w:r>
           </w:p>
         </w:tc>
@@ -5811,7 +6104,95 @@
     </w:p>
     <w:p>
       <w:pPr>
-        <w:spacing w:after="0"/>
+        <w:spacing w:after="0" w:line="240" w:lineRule="auto"/>
+        <w:ind w:left="4678"/>
+        <w:rPr>
+          <w:rFonts w:ascii="Arial" w:hAnsi="Arial" w:cs="Arial"/>
+          <w:lang w:val="en-US"/>
+        </w:rPr>
+      </w:pPr>
+    </w:p>
+    <w:p>
+      <w:pPr>
+        <w:spacing w:after="0" w:line="240" w:lineRule="auto"/>
+        <w:ind w:left="4678"/>
+        <w:rPr>
+          <w:rFonts w:ascii="Arial" w:hAnsi="Arial" w:cs="Arial"/>
+          <w:lang w:val="en-US"/>
+        </w:rPr>
+      </w:pPr>
+    </w:p>
+    <w:p>
+      <w:pPr>
+        <w:spacing w:after="0" w:line="240" w:lineRule="auto"/>
+        <w:ind w:left="4678"/>
+        <w:rPr>
+          <w:rFonts w:ascii="Arial" w:hAnsi="Arial" w:cs="Arial"/>
+          <w:lang w:val="en-US"/>
+        </w:rPr>
+      </w:pPr>
+    </w:p>
+    <w:p>
+      <w:pPr>
+        <w:spacing w:after="0" w:line="240" w:lineRule="auto"/>
+        <w:ind w:left="4678"/>
+        <w:rPr>
+          <w:rFonts w:ascii="Arial" w:hAnsi="Arial" w:cs="Arial"/>
+          <w:lang w:val="en-US"/>
+        </w:rPr>
+      </w:pPr>
+      <w:r>
+        <w:rPr>
+          <w:rFonts w:ascii="Arial" w:hAnsi="Arial" w:cs="Arial"/>
+          <w:lang w:val="en-US"/>
+        </w:rPr>
+        <w:t xml:space="preserve">     </w:t>
+      </w:r>
+      <w:r>
+        <w:rPr>
+          <w:rFonts w:ascii="Arial" w:hAnsi="Arial" w:cs="Arial"/>
+          <w:lang w:val="en-US"/>
+        </w:rPr>
+        <w:fldChar w:fldCharType="begin"/>
+      </w:r>
+      <w:r>
+        <w:rPr>
+          <w:rFonts w:ascii="Arial" w:hAnsi="Arial" w:cs="Arial"/>
+          <w:lang w:val="en-US"/>
+        </w:rPr>
+        <w:instrText xml:space="preserve"> MERGEFIELD tte </w:instrText>
+      </w:r>
+      <w:r>
+        <w:rPr>
+          <w:rFonts w:ascii="Arial" w:hAnsi="Arial" w:cs="Arial"/>
+          <w:lang w:val="en-US"/>
+        </w:rPr>
+        <w:fldChar w:fldCharType="end"/>
+      </w:r>
+    </w:p>
+    <w:p>
+      <w:pPr>
+        <w:spacing w:after="0" w:line="240" w:lineRule="auto"/>
+        <w:ind w:left="4678"/>
+        <w:rPr>
+          <w:rFonts w:ascii="Arial" w:hAnsi="Arial" w:cs="Arial"/>
+          <w:lang w:val="en-US"/>
+        </w:rPr>
+      </w:pPr>
+    </w:p>
+    <w:p>
+      <w:pPr>
+        <w:spacing w:after="0" w:line="240" w:lineRule="auto"/>
+        <w:ind w:left="4678"/>
+        <w:rPr>
+          <w:rFonts w:ascii="Arial" w:hAnsi="Arial" w:cs="Arial"/>
+          <w:lang w:val="en-US"/>
+        </w:rPr>
+      </w:pPr>
+    </w:p>
+    <w:p>
+      <w:pPr>
+        <w:spacing w:after="0" w:line="240" w:lineRule="auto"/>
         <w:ind w:left="4678"/>
         <w:rPr>
           <w:rFonts w:ascii="Arial" w:hAnsi="Arial" w:cs="Arial"/>
@@ -5828,36 +6209,6 @@
           <w:lang w:val="en-US"/>
         </w:rPr>
       </w:pPr>
-    </w:p>
-    <w:p>
-      <w:pPr>
-        <w:spacing w:after="0"/>
-        <w:ind w:left="4678"/>
-        <w:rPr>
-          <w:rFonts w:ascii="Arial" w:hAnsi="Arial" w:cs="Arial"/>
-          <w:lang w:val="en-US"/>
-        </w:rPr>
-      </w:pPr>
-    </w:p>
-    <w:p>
-      <w:pPr>
-        <w:spacing w:after="0"/>
-        <w:ind w:left="4678"/>
-        <w:rPr>
-          <w:rFonts w:ascii="Arial" w:hAnsi="Arial" w:cs="Arial"/>
-          <w:lang w:val="en-US"/>
-        </w:rPr>
-      </w:pPr>
-    </w:p>
-    <w:p>
-      <w:pPr>
-        <w:spacing w:after="0"/>
-        <w:ind w:left="4678"/>
-        <w:rPr>
-          <w:rFonts w:ascii="Arial" w:hAnsi="Arial" w:cs="Arial"/>
-          <w:lang w:val="en-US"/>
-        </w:rPr>
-      </w:pPr>
       <w:r>
         <w:rPr>
           <w:rFonts w:ascii="Arial" w:hAnsi="Arial" w:cs="Arial"/>
@@ -5885,7 +6236,7 @@
           <w:noProof/>
           <w:lang w:val="en-US"/>
         </w:rPr>
-        <w:t>PANDARIA RILIYANA S.P, M.M</w:t>
+        <w:t>Ir LINGGA SAKTI DAMAYANTI S.Hut., M.M</w:t>
       </w:r>
       <w:r>
         <w:rPr>
@@ -5938,7 +6289,7 @@
           <w:noProof/>
           <w:lang w:val="en-US"/>
         </w:rPr>
-        <w:t>19780105 200212 2 002</w:t>
+        <w:t>19820418 200604 2 012</w:t>
       </w:r>
       <w:r>
         <w:rPr>
@@ -6031,7 +6382,7 @@
           <w:noProof/>
           <w:lang w:val="en-US"/>
         </w:rPr>
-        <w:t>FEBRUARI</w:t>
+        <w:t>JUNI</w:t>
       </w:r>
       <w:r>
         <w:rPr>
@@ -6158,7 +6509,7 @@
                 <w:rFonts w:ascii="Arial" w:hAnsi="Arial" w:cs="Arial"/>
                 <w:noProof/>
               </w:rPr>
-              <w:t>WALIJO, S.A.P</w:t>
+              <w:t>AZANU RUDIT SEPTIMA S.P</w:t>
             </w:r>
             <w:r>
               <w:rPr>
@@ -6254,7 +6605,7 @@
                 <w:noProof/>
                 <w:lang w:val="sv-SE"/>
               </w:rPr>
-              <w:t>19770424 200701 1 007</w:t>
+              <w:t>19900507 201403 1 002</w:t>
             </w:r>
             <w:r>
               <w:rPr>
@@ -6350,7 +6701,7 @@
                 <w:noProof/>
                 <w:lang w:val="sv-SE"/>
               </w:rPr>
-              <w:t>III/a</w:t>
+              <w:t>III/d</w:t>
             </w:r>
             <w:r>
               <w:rPr>
@@ -6446,7 +6797,7 @@
                 <w:noProof/>
                 <w:lang w:val="sv-SE"/>
               </w:rPr>
-              <w:t>PENATA KELOLA SISTEM DAN TEKNOLOGI INFORMASI</w:t>
+              <w:t>ANALIS SDM APARATUR AHLI MUDA</w:t>
             </w:r>
             <w:r>
               <w:rPr>
@@ -6542,7 +6893,7 @@
                 <w:noProof/>
                 <w:lang w:val="sv-SE"/>
               </w:rPr>
-              <w:t>7</w:t>
+              <w:t>10</w:t>
             </w:r>
             <w:r>
               <w:rPr>
@@ -7359,7 +7710,7 @@
                 <w:noProof/>
                 <w:lang w:val="en-US"/>
               </w:rPr>
-              <w:t>0</w:t>
+              <w:t>20</w:t>
             </w:r>
             <w:r>
               <w:rPr>
@@ -7402,7 +7753,7 @@
                 <w:noProof/>
                 <w:lang w:val="en-US"/>
               </w:rPr>
-              <w:t>0</w:t>
+              <w:t>20</w:t>
             </w:r>
             <w:r>
               <w:rPr>
@@ -7718,6 +8069,12 @@
               <w:rPr>
                 <w:rFonts w:ascii="Arial" w:hAnsi="Arial" w:cs="Arial"/>
               </w:rPr>
+              <w:instrText>\#"0,00"</w:instrText>
+            </w:r>
+            <w:r>
+              <w:rPr>
+                <w:rFonts w:ascii="Arial" w:hAnsi="Arial" w:cs="Arial"/>
+              </w:rPr>
               <w:fldChar w:fldCharType="separate"/>
             </w:r>
             <w:r>
@@ -7725,7 +8082,7 @@
                 <w:rFonts w:ascii="Arial" w:hAnsi="Arial" w:cs="Arial"/>
                 <w:noProof/>
               </w:rPr>
-              <w:t>40</w:t>
+              <w:t>40,00</w:t>
             </w:r>
             <w:r>
               <w:rPr>
@@ -7739,23 +8096,6 @@
               </w:rPr>
               <w:t>%</w:t>
             </w:r>
-          </w:p>
-        </w:tc>
-      </w:tr>
-      <w:tr>
-        <w:tc>
-          <w:tcPr>
-            <w:tcW w:w="9351" w:type="dxa"/>
-            <w:gridSpan w:val="10"/>
-          </w:tcPr>
-          <w:p>
-            <w:pPr>
-              <w:jc w:val="right"/>
-              <w:rPr>
-                <w:rFonts w:ascii="Arial" w:hAnsi="Arial" w:cs="Arial"/>
-                <w:lang w:val="en-US"/>
-              </w:rPr>
-            </w:pPr>
           </w:p>
         </w:tc>
       </w:tr>
@@ -8580,6 +8920,12 @@
             <w:r>
               <w:rPr>
                 <w:rFonts w:ascii="Arial" w:hAnsi="Arial" w:cs="Arial"/>
+              </w:rPr>
+              <w:instrText>\#"0,00"</w:instrText>
+            </w:r>
+            <w:r>
+              <w:rPr>
+                <w:rFonts w:ascii="Arial" w:hAnsi="Arial" w:cs="Arial"/>
                 <w:lang w:val="en-US"/>
               </w:rPr>
               <w:fldChar w:fldCharType="separate"/>
@@ -8588,9 +8934,8 @@
               <w:rPr>
                 <w:rFonts w:ascii="Arial" w:hAnsi="Arial" w:cs="Arial"/>
                 <w:noProof/>
-                <w:lang w:val="en-US"/>
-              </w:rPr>
-              <w:t>100</w:t>
+              </w:rPr>
+              <w:t>100,00</w:t>
             </w:r>
             <w:r>
               <w:rPr>
@@ -8747,7 +9092,7 @@
                 <w:noProof/>
                 <w:lang w:val="en-US"/>
               </w:rPr>
-              <w:t>0</w:t>
+              <w:t>2</w:t>
             </w:r>
             <w:r>
               <w:rPr>
@@ -8864,7 +9209,7 @@
               <w:rPr>
                 <w:rFonts w:ascii="Arial" w:hAnsi="Arial" w:cs="Arial"/>
               </w:rPr>
-              <w:instrText>\# "0,00</w:instrText>
+              <w:instrText/>
             </w:r>
             <w:r>
               <w:rPr>
@@ -8878,7 +9223,7 @@
                 <w:rFonts w:ascii="Arial" w:hAnsi="Arial" w:cs="Arial"/>
                 <w:noProof/>
               </w:rPr>
-              <w:t>100,00</w:t>
+              <w:t>98,00</w:t>
             </w:r>
             <w:r>
               <w:rPr>
@@ -9001,7 +9346,7 @@
               <w:rPr>
                 <w:rFonts w:ascii="Arial" w:hAnsi="Arial" w:cs="Arial"/>
               </w:rPr>
-              <w:instrText>\# "0,00</w:instrText>
+              <w:instrText/>
             </w:r>
             <w:r>
               <w:rPr>
@@ -9015,7 +9360,7 @@
                 <w:rFonts w:ascii="Arial" w:hAnsi="Arial" w:cs="Arial"/>
                 <w:noProof/>
               </w:rPr>
-              <w:t>100,00</w:t>
+              <w:t>98,00</w:t>
             </w:r>
             <w:r>
               <w:rPr>
@@ -9049,7 +9394,7 @@
               <w:rPr>
                 <w:rFonts w:ascii="Arial" w:hAnsi="Arial" w:cs="Arial"/>
               </w:rPr>
-              <w:instrText>\# #.###</w:instrText>
+              <w:instrText/>
             </w:r>
             <w:r>
               <w:rPr>
@@ -9063,7 +9408,7 @@
                 <w:rFonts w:ascii="Arial" w:hAnsi="Arial" w:cs="Arial"/>
                 <w:noProof/>
               </w:rPr>
-              <w:t>2.220.000</w:t>
+              <w:t>5.050.000</w:t>
             </w:r>
             <w:r>
               <w:rPr>
@@ -9140,7 +9485,7 @@
               <w:rPr>
                 <w:rFonts w:ascii="Arial" w:hAnsi="Arial" w:cs="Arial"/>
               </w:rPr>
-              <w:instrText>\# #.###</w:instrText>
+              <w:instrText/>
             </w:r>
             <w:r>
               <w:rPr>
@@ -9154,7 +9499,7 @@
                 <w:rFonts w:ascii="Arial" w:hAnsi="Arial" w:cs="Arial"/>
                 <w:noProof/>
               </w:rPr>
-              <w:t>2.220.000</w:t>
+              <w:t>4.949.000</w:t>
             </w:r>
             <w:r>
               <w:rPr>
@@ -9282,21 +9627,6 @@
                 <w:rFonts w:ascii="Arial" w:hAnsi="Arial" w:cs="Arial"/>
                 <w:lang w:val="en-US"/>
               </w:rPr>
-              <w:fldChar w:fldCharType="separate"/>
-            </w:r>
-            <w:r>
-              <w:rPr>
-                <w:rFonts w:ascii="Arial" w:hAnsi="Arial" w:cs="Arial"/>
-                <w:noProof/>
-                <w:lang w:val="en-US"/>
-              </w:rPr>
-              <w:t>444.000</w:t>
-            </w:r>
-            <w:r>
-              <w:rPr>
-                <w:rFonts w:ascii="Arial" w:hAnsi="Arial" w:cs="Arial"/>
-                <w:lang w:val="en-US"/>
-              </w:rPr>
               <w:fldChar w:fldCharType="end"/>
             </w:r>
             <w:r>
@@ -9477,7 +9807,7 @@
               <w:rPr>
                 <w:rFonts w:ascii="Arial" w:hAnsi="Arial" w:cs="Arial"/>
               </w:rPr>
-              <w:instrText>\# #.###</w:instrText>
+              <w:instrText/>
             </w:r>
             <w:r>
               <w:rPr>
@@ -9491,7 +9821,7 @@
                 <w:rFonts w:ascii="Arial" w:hAnsi="Arial" w:cs="Arial"/>
                 <w:noProof/>
               </w:rPr>
-              <w:t>2.664.000</w:t>
+              <w:t>4.949.000</w:t>
             </w:r>
             <w:r>
               <w:rPr>
@@ -9640,7 +9970,7 @@
               <w:rPr>
                 <w:rFonts w:ascii="Arial" w:hAnsi="Arial" w:cs="Arial"/>
               </w:rPr>
-              <w:instrText>\# #.###</w:instrText>
+              <w:instrText/>
             </w:r>
             <w:r>
               <w:rPr>
@@ -9654,7 +9984,7 @@
                 <w:rFonts w:ascii="Arial" w:hAnsi="Arial" w:cs="Arial"/>
                 <w:noProof/>
               </w:rPr>
-              <w:t>133.200</w:t>
+              <w:t>247.450</w:t>
             </w:r>
             <w:r>
               <w:rPr>
@@ -9780,7 +10110,7 @@
               <w:rPr>
                 <w:rFonts w:ascii="Arial" w:hAnsi="Arial" w:cs="Arial"/>
               </w:rPr>
-              <w:instrText>\# #.###</w:instrText>
+              <w:instrText/>
             </w:r>
             <w:r>
               <w:rPr>
@@ -9794,7 +10124,7 @@
                 <w:rFonts w:ascii="Arial" w:hAnsi="Arial" w:cs="Arial"/>
                 <w:noProof/>
               </w:rPr>
-              <w:t>22.200</w:t>
+              <w:t>49.490</w:t>
             </w:r>
             <w:r>
               <w:rPr>
@@ -9920,7 +10250,7 @@
               <w:rPr>
                 <w:rFonts w:ascii="Arial" w:hAnsi="Arial" w:cs="Arial"/>
               </w:rPr>
-              <w:instrText>\# #.###</w:instrText>
+              <w:instrText/>
             </w:r>
             <w:r>
               <w:rPr>
@@ -9934,7 +10264,7 @@
                 <w:rFonts w:ascii="Arial" w:hAnsi="Arial" w:cs="Arial"/>
                 <w:noProof/>
               </w:rPr>
-              <w:t>30.000</w:t>
+              <w:t>116.302</w:t>
             </w:r>
             <w:r>
               <w:rPr>
@@ -10052,7 +10382,7 @@
               <w:rPr>
                 <w:rFonts w:ascii="Arial" w:hAnsi="Arial" w:cs="Arial"/>
               </w:rPr>
-              <w:instrText>\# #.###</w:instrText>
+              <w:instrText/>
             </w:r>
             <w:r>
               <w:rPr>
@@ -10066,7 +10396,7 @@
                 <w:rFonts w:ascii="Arial" w:hAnsi="Arial" w:cs="Arial"/>
                 <w:noProof/>
               </w:rPr>
-              <w:t>2.478.600</w:t>
+              <w:t>4.535.758</w:t>
             </w:r>
             <w:r>
               <w:rPr>
@@ -10126,7 +10456,95 @@
     </w:p>
     <w:p>
       <w:pPr>
-        <w:spacing w:after="0"/>
+        <w:spacing w:after="0" w:line="240" w:lineRule="auto"/>
+        <w:ind w:left="4678"/>
+        <w:rPr>
+          <w:rFonts w:ascii="Arial" w:hAnsi="Arial" w:cs="Arial"/>
+          <w:lang w:val="en-US"/>
+        </w:rPr>
+      </w:pPr>
+    </w:p>
+    <w:p>
+      <w:pPr>
+        <w:spacing w:after="0" w:line="240" w:lineRule="auto"/>
+        <w:ind w:left="4678"/>
+        <w:rPr>
+          <w:rFonts w:ascii="Arial" w:hAnsi="Arial" w:cs="Arial"/>
+          <w:lang w:val="en-US"/>
+        </w:rPr>
+      </w:pPr>
+    </w:p>
+    <w:p>
+      <w:pPr>
+        <w:spacing w:after="0" w:line="240" w:lineRule="auto"/>
+        <w:ind w:left="4678"/>
+        <w:rPr>
+          <w:rFonts w:ascii="Arial" w:hAnsi="Arial" w:cs="Arial"/>
+          <w:lang w:val="en-US"/>
+        </w:rPr>
+      </w:pPr>
+    </w:p>
+    <w:p>
+      <w:pPr>
+        <w:spacing w:after="0" w:line="240" w:lineRule="auto"/>
+        <w:ind w:left="4678"/>
+        <w:rPr>
+          <w:rFonts w:ascii="Arial" w:hAnsi="Arial" w:cs="Arial"/>
+          <w:lang w:val="en-US"/>
+        </w:rPr>
+      </w:pPr>
+      <w:r>
+        <w:rPr>
+          <w:rFonts w:ascii="Arial" w:hAnsi="Arial" w:cs="Arial"/>
+          <w:lang w:val="en-US"/>
+        </w:rPr>
+        <w:t xml:space="preserve">     </w:t>
+      </w:r>
+      <w:r>
+        <w:rPr>
+          <w:rFonts w:ascii="Arial" w:hAnsi="Arial" w:cs="Arial"/>
+          <w:lang w:val="en-US"/>
+        </w:rPr>
+        <w:fldChar w:fldCharType="begin"/>
+      </w:r>
+      <w:r>
+        <w:rPr>
+          <w:rFonts w:ascii="Arial" w:hAnsi="Arial" w:cs="Arial"/>
+          <w:lang w:val="en-US"/>
+        </w:rPr>
+        <w:instrText xml:space="preserve"> MERGEFIELD tte </w:instrText>
+      </w:r>
+      <w:r>
+        <w:rPr>
+          <w:rFonts w:ascii="Arial" w:hAnsi="Arial" w:cs="Arial"/>
+          <w:lang w:val="en-US"/>
+        </w:rPr>
+        <w:fldChar w:fldCharType="end"/>
+      </w:r>
+    </w:p>
+    <w:p>
+      <w:pPr>
+        <w:spacing w:after="0" w:line="240" w:lineRule="auto"/>
+        <w:ind w:left="4678"/>
+        <w:rPr>
+          <w:rFonts w:ascii="Arial" w:hAnsi="Arial" w:cs="Arial"/>
+          <w:lang w:val="en-US"/>
+        </w:rPr>
+      </w:pPr>
+    </w:p>
+    <w:p>
+      <w:pPr>
+        <w:spacing w:after="0" w:line="240" w:lineRule="auto"/>
+        <w:ind w:left="4678"/>
+        <w:rPr>
+          <w:rFonts w:ascii="Arial" w:hAnsi="Arial" w:cs="Arial"/>
+          <w:lang w:val="en-US"/>
+        </w:rPr>
+      </w:pPr>
+    </w:p>
+    <w:p>
+      <w:pPr>
+        <w:spacing w:after="0" w:line="240" w:lineRule="auto"/>
         <w:ind w:left="4678"/>
         <w:rPr>
           <w:rFonts w:ascii="Arial" w:hAnsi="Arial" w:cs="Arial"/>
@@ -10143,36 +10561,6 @@
           <w:lang w:val="en-US"/>
         </w:rPr>
       </w:pPr>
-    </w:p>
-    <w:p>
-      <w:pPr>
-        <w:spacing w:after="0"/>
-        <w:ind w:left="4678"/>
-        <w:rPr>
-          <w:rFonts w:ascii="Arial" w:hAnsi="Arial" w:cs="Arial"/>
-          <w:lang w:val="en-US"/>
-        </w:rPr>
-      </w:pPr>
-    </w:p>
-    <w:p>
-      <w:pPr>
-        <w:spacing w:after="0"/>
-        <w:ind w:left="4678"/>
-        <w:rPr>
-          <w:rFonts w:ascii="Arial" w:hAnsi="Arial" w:cs="Arial"/>
-          <w:lang w:val="en-US"/>
-        </w:rPr>
-      </w:pPr>
-    </w:p>
-    <w:p>
-      <w:pPr>
-        <w:spacing w:after="0"/>
-        <w:ind w:left="4678"/>
-        <w:rPr>
-          <w:rFonts w:ascii="Arial" w:hAnsi="Arial" w:cs="Arial"/>
-          <w:lang w:val="en-US"/>
-        </w:rPr>
-      </w:pPr>
       <w:r>
         <w:rPr>
           <w:rFonts w:ascii="Arial" w:hAnsi="Arial" w:cs="Arial"/>
@@ -10200,7 +10588,7 @@
           <w:noProof/>
           <w:lang w:val="en-US"/>
         </w:rPr>
-        <w:t>PANDARIA RILIYANA S.P, M.M</w:t>
+        <w:t>Ir LINGGA SAKTI DAMAYANTI S.Hut., M.M</w:t>
       </w:r>
       <w:r>
         <w:rPr>
@@ -10253,7 +10641,7 @@
           <w:noProof/>
           <w:lang w:val="en-US"/>
         </w:rPr>
-        <w:t>19780105 200212 2 002</w:t>
+        <w:t>19820418 200604 2 012</w:t>
       </w:r>
       <w:r>
         <w:rPr>
@@ -10262,14 +10650,6 @@
         </w:rPr>
         <w:fldChar w:fldCharType="end"/>
       </w:r>
-    </w:p>
-    <w:p>
-      <w:pPr>
-        <w:rPr>
-          <w:rFonts w:ascii="Arial" w:hAnsi="Arial" w:cs="Arial"/>
-          <w:lang w:val="en-US"/>
-        </w:rPr>
-      </w:pPr>
     </w:p>
     <w:sectPr>
       <w:pgSz w:w="11906" w:h="16838"/>

</xml_diff>

<commit_message>
fix: remove 0,00 field switches to fix 060% formatting and ensure full rupiah numbers
</commit_message>
<xml_diff>
--- a/files/TEMPLATE_TPP.docx
+++ b/files/TEMPLATE_TPP.docx
@@ -1009,7 +1009,7 @@
               <w:rPr>
                 <w:rFonts w:ascii="Arial" w:hAnsi="Arial" w:cs="Arial"/>
               </w:rPr>
-              <w:instrText>\#"0,00"</w:instrText>
+              <w:instrText>\</w:instrText>
             </w:r>
             <w:r>
               <w:rPr>
@@ -1066,7 +1066,7 @@
               <w:rPr>
                 <w:rFonts w:ascii="Arial" w:hAnsi="Arial" w:cs="Arial"/>
               </w:rPr>
-              <w:instrText>\#"0,00"</w:instrText>
+              <w:instrText>\</w:instrText>
             </w:r>
             <w:r>
               <w:rPr>
@@ -1123,7 +1123,7 @@
               <w:rPr>
                 <w:rFonts w:ascii="Arial" w:hAnsi="Arial" w:cs="Arial"/>
               </w:rPr>
-              <w:instrText>\#"0,00"</w:instrText>
+              <w:instrText>\</w:instrText>
             </w:r>
             <w:r>
               <w:rPr>
@@ -1186,7 +1186,7 @@
               <w:rPr>
                 <w:rFonts w:ascii="Arial" w:hAnsi="Arial" w:cs="Arial"/>
               </w:rPr>
-              <w:instrText>\#"0,00"</w:instrText>
+              <w:instrText>\</w:instrText>
             </w:r>
             <w:r>
               <w:rPr>
@@ -8069,7 +8069,7 @@
               <w:rPr>
                 <w:rFonts w:ascii="Arial" w:hAnsi="Arial" w:cs="Arial"/>
               </w:rPr>
-              <w:instrText>\#"0,00"</w:instrText>
+              <w:instrText>\</w:instrText>
             </w:r>
             <w:r>
               <w:rPr>
@@ -8921,7 +8921,7 @@
               <w:rPr>
                 <w:rFonts w:ascii="Arial" w:hAnsi="Arial" w:cs="Arial"/>
               </w:rPr>
-              <w:instrText>\#"0,00"</w:instrText>
+              <w:instrText>\</w:instrText>
             </w:r>
             <w:r>
               <w:rPr>

</xml_diff>

<commit_message>
fix: format TPP calculation table percentages as 060%, 040%, 000%, 100% and rupiah as Rp. 9.435.000 consistently on both Mac and Windows
</commit_message>
<xml_diff>
--- a/files/TEMPLATE_TPP.docx
+++ b/files/TEMPLATE_TPP.docx
@@ -1009,7 +1009,7 @@
               <w:rPr>
                 <w:rFonts w:ascii="Arial" w:hAnsi="Arial" w:cs="Arial"/>
               </w:rPr>
-              <w:instrText>\</w:instrText>
+              <w:instrText/>
             </w:r>
             <w:r>
               <w:rPr>
@@ -1066,7 +1066,7 @@
               <w:rPr>
                 <w:rFonts w:ascii="Arial" w:hAnsi="Arial" w:cs="Arial"/>
               </w:rPr>
-              <w:instrText>\</w:instrText>
+              <w:instrText/>
             </w:r>
             <w:r>
               <w:rPr>
@@ -1123,7 +1123,7 @@
               <w:rPr>
                 <w:rFonts w:ascii="Arial" w:hAnsi="Arial" w:cs="Arial"/>
               </w:rPr>
-              <w:instrText>\</w:instrText>
+              <w:instrText/>
             </w:r>
             <w:r>
               <w:rPr>
@@ -1186,7 +1186,7 @@
               <w:rPr>
                 <w:rFonts w:ascii="Arial" w:hAnsi="Arial" w:cs="Arial"/>
               </w:rPr>
-              <w:instrText>\</w:instrText>
+              <w:instrText/>
             </w:r>
             <w:r>
               <w:rPr>
@@ -8069,7 +8069,7 @@
               <w:rPr>
                 <w:rFonts w:ascii="Arial" w:hAnsi="Arial" w:cs="Arial"/>
               </w:rPr>
-              <w:instrText>\</w:instrText>
+              <w:instrText/>
             </w:r>
             <w:r>
               <w:rPr>
@@ -8921,7 +8921,7 @@
               <w:rPr>
                 <w:rFonts w:ascii="Arial" w:hAnsi="Arial" w:cs="Arial"/>
               </w:rPr>
-              <w:instrText>\</w:instrText>
+              <w:instrText/>
             </w:r>
             <w:r>
               <w:rPr>

</xml_diff>